<commit_message>
Update report with author info (王毅, 韩中元) and funding (24BYY080); revise full experiment summary
</commit_message>
<xml_diff>
--- a/docs/PAN26_report_v1.docx
+++ b/docs/PAN26_report_v1.docx
@@ -26,7 +26,7 @@
           <w:rFonts w:ascii="宋体" w:hAnsi="宋体" w:eastAsia="宋体"/>
           <w:sz w:val="21"/>
         </w:rPr>
-        <w:t>[学生姓名]¹  [教师姓名]¹,²(通讯作者)  [参与学生姓名]¹</w:t>
+        <w:t>王毅¹  韩中元¹(通讯作者)</w:t>
       </w:r>
     </w:p>
     <w:p>
@@ -52,7 +52,7 @@
           <w:rFonts w:ascii="宋体" w:hAnsi="宋体" w:eastAsia="宋体"/>
           <w:sz w:val="18"/>
         </w:rPr>
-        <w:t>2. [通讯作者单位，如与1不同]</w:t>
+        <w:t>2. 通讯作者，韩中元，[邮箱待填写]</w:t>
       </w:r>
     </w:p>
     <w:p>
@@ -65,7 +65,7 @@
           <w:rFonts w:ascii="宋体" w:hAnsi="宋体" w:eastAsia="宋体"/>
           <w:sz w:val="18"/>
         </w:rPr>
-        <w:t>[通讯作者邮箱]</w:t>
+        <w:t>[通讯作者邮箱，请填写]</w:t>
       </w:r>
     </w:p>
     <w:p>
@@ -1166,7 +1166,7 @@
           <w:b w:val="0"/>
           <w:sz w:val="21"/>
         </w:rPr>
-        <w:t>本研究受[基金名称]（项目编号：[基金号]）资助。感谢PAN@CLEF评测组织者提供的数据集和评测平台。</w:t>
+        <w:t>This work is supported by the National Social Science Foundation of China (24BYY080). 感谢PAN@CLEF评测组织者提供的数据集和评测平台。</w:t>
       </w:r>
     </w:p>
     <w:p>

</xml_diff>

<commit_message>
Add full academic paper (docx) with author/funding info; update evaluation report
Paper: Query-Chunk Provenance Modeling for PAN26 source retrieval
- Chinese title + English abstract
- Authors: 王毅, 韩中元 (通讯作者), 佛山大学
- Funding: National Social Science Foundation of China (24BYY080)
- Sections: Intro, Related Work, Method (3.1-3.4), Experiments (4.1-4.4), Discussion, Conclusion
- 3 tables (800q, 1200q, ablation), 14 references
</commit_message>
<xml_diff>
--- a/docs/PAN26_report_v1.docx
+++ b/docs/PAN26_report_v1.docx
@@ -39,7 +39,7 @@
           <w:rFonts w:ascii="宋体" w:hAnsi="宋体" w:eastAsia="宋体"/>
           <w:sz w:val="18"/>
         </w:rPr>
-        <w:t>1. [学校名称] [学院名称], [城市] [邮编]</w:t>
+        <w:t>1. 佛山大学 [学院名称], 佛山 528000</w:t>
       </w:r>
     </w:p>
     <w:p>
@@ -52,7 +52,7 @@
           <w:rFonts w:ascii="宋体" w:hAnsi="宋体" w:eastAsia="宋体"/>
           <w:sz w:val="18"/>
         </w:rPr>
-        <w:t>2. 通讯作者，韩中元，[邮箱待填写]</w:t>
+        <w:t>通讯作者邮箱：wangyi0187@icloud.com</w:t>
       </w:r>
     </w:p>
     <w:p>
@@ -65,7 +65,7 @@
           <w:rFonts w:ascii="宋体" w:hAnsi="宋体" w:eastAsia="宋体"/>
           <w:sz w:val="18"/>
         </w:rPr>
-        <w:t>[通讯作者邮箱，请填写]</w:t>
+        <w:t>E-mail: wangyi0187@icloud.com</w:t>
       </w:r>
     </w:p>
     <w:p>

</xml_diff>